<commit_message>
Manuales de instalación y de usuario; compatibilidad con Windows
- docs/MANUAL_INSTALACION.md y docs/MANUAL_USUARIO.md, con versión Word en entregables/
- Scripts y pruebas con UTF-8 explícito (fallaban en consolas cp1252 de Windows)
- .gitattributes: los .sh conservan LF para funcionar en Git Bash y Docker
- /docs declara el esquema Bearer (botón Authorize)
- El rechazo 413 ahora lleva request_id y queda en el registro de auditoría

Co-Authored-By: Claude Opus 5.5 <noreply@anthropic.com>
Claude-Session: https://claude.ai/code/session_017BULTufAgsUeH7bxarRoz6
</commit_message>
<xml_diff>
--- a/entregables/Mapeo_OWASP_Gateway_LLM.docx
+++ b/entregables/Mapeo_OWASP_Gateway_LLM.docx
@@ -7338,6 +7338,18 @@
           <w:szCs w:val="19"/>
         </w:rPr>
         <w:t xml:space="preserve">validacion_fallida</w:t>
+      </w:r>
+      <w:r>
+        <w:t xml:space="preserve">, </w:t>
+      </w:r>
+      <w:r>
+        <w:rPr>
+          <w:rFonts w:ascii="Consolas" w:cs="Consolas" w:eastAsia="Consolas" w:hAnsi="Consolas"/>
+          <w:color w:val="8B1A1A"/>
+          <w:sz w:val="19"/>
+          <w:szCs w:val="19"/>
+        </w:rPr>
+        <w:t xml:space="preserve">cuerpo_demasiado_grande</w:t>
       </w:r>
       <w:r>
         <w:t xml:space="preserve">), </w:t>

</xml_diff>